<commit_message>
Add confidence intervals, no-star tables, fragments, and 12 journals
Renderer: confidence intervals on the same row, below the estimate,
or in their own column; tables without significance stars; Roman
numeral table numbers; and --fragment output for venue templates. The
statsmodels path passes intervals at the profile's level.

Profiles: Nature, Science, AER, QJE, APSR, AJPS, JAMA, AJPH, JASA,
Journal of Communication, CHI, and NeurIPS, with families for the AEA,
AMA, APA 7, ACM, and Nature Portfolio styles. Every rule cites the
official page read on 2026-10-24, or is marked provisional. PNAS now
cites its guidelines and shows the intervals its profile asked for.

Linter: a no-stars rule, an interval check, and a decimal count that
no longer misreads LaTeX lengths. Every intended change from the
original outputs is listed in tests/baselines/ALLOWED_DIFFS.md.
</commit_message>
<xml_diff>
--- a/tests/baselines/PNAS_csv.docx
+++ b/tests/baselines/PNAS_csv.docx
@@ -17,15 +17,15 @@
     <w:tbl>
       <w:tblPr>
         <w:tblStyle w:val="Table"/>
-        <w:tblW w:type="pct" w:w="3958"/>
+        <w:tblW w:type="pct" w:w="4885"/>
         <w:tblLayout w:type="fixed"/>
-        <w:tblLook w:firstRow="1" w:lastRow="1" w:firstColumn="0" w:lastColumn="0" w:noHBand="0" w:noVBand="0" w:val="0020"/>
+        <w:tblLook w:firstRow="1" w:lastRow="0" w:firstColumn="0" w:lastColumn="0" w:noHBand="0" w:noVBand="0" w:val="0020"/>
       </w:tblPr>
       <w:tblGrid>
-        <w:gridCol w:w="3960"/>
-        <w:gridCol w:w="1100"/>
-        <w:gridCol w:w="1100"/>
-        <w:gridCol w:w="110"/>
+        <w:gridCol w:w="3277"/>
+        <w:gridCol w:w="2184"/>
+        <w:gridCol w:w="2184"/>
+        <w:gridCol w:w="91"/>
       </w:tblGrid>
       <w:tr>
         <w:trPr>
@@ -89,18 +89,18 @@
               <w:pStyle w:val="Compact"/>
             </w:pPr>
             <w:r>
-              <w:t xml:space="preserve">1.20‡</w:t>
-            </w:r>
-          </w:p>
-        </w:tc>
-        <w:tc>
-          <w:tcPr/>
-          <w:p>
-            <w:pPr>
-              <w:pStyle w:val="Compact"/>
-            </w:pPr>
-            <w:r>
-              <w:t xml:space="preserve">0.95‡</w:t>
+              <w:t xml:space="preserve">1.20‡ [0.79, 1.64]</w:t>
+            </w:r>
+          </w:p>
+        </w:tc>
+        <w:tc>
+          <w:tcPr/>
+          <w:p>
+            <w:pPr>
+              <w:pStyle w:val="Compact"/>
+            </w:pPr>
+            <w:r>
+              <w:t xml:space="preserve">0.95‡ [0.50, 1.42]</w:t>
             </w:r>
           </w:p>
         </w:tc>
@@ -120,27 +120,30 @@
             <w:pPr>
               <w:pStyle w:val="Compact"/>
             </w:pPr>
-          </w:p>
-        </w:tc>
-        <w:tc>
-          <w:tcPr/>
-          <w:p>
-            <w:pPr>
-              <w:pStyle w:val="Compact"/>
-            </w:pPr>
-            <w:r>
-              <w:t xml:space="preserve">(0.21)</w:t>
-            </w:r>
-          </w:p>
-        </w:tc>
-        <w:tc>
-          <w:tcPr/>
-          <w:p>
-            <w:pPr>
-              <w:pStyle w:val="Compact"/>
-            </w:pPr>
-            <w:r>
-              <w:t xml:space="preserve">(0.23)</w:t>
+            <w:r>
+              <w:t xml:space="preserve">Years of education</w:t>
+            </w:r>
+          </w:p>
+        </w:tc>
+        <w:tc>
+          <w:tcPr/>
+          <w:p>
+            <w:pPr>
+              <w:pStyle w:val="Compact"/>
+            </w:pPr>
+            <w:r>
+              <w:t xml:space="preserve">0.08‡ [0.06, 0.11]</w:t>
+            </w:r>
+          </w:p>
+        </w:tc>
+        <w:tc>
+          <w:tcPr/>
+          <w:p>
+            <w:pPr>
+              <w:pStyle w:val="Compact"/>
+            </w:pPr>
+            <w:r>
+              <w:t xml:space="preserve">0.06‡ [0.03, 0.09]</w:t>
             </w:r>
           </w:p>
         </w:tc>
@@ -161,89 +164,6 @@
               <w:pStyle w:val="Compact"/>
             </w:pPr>
             <w:r>
-              <w:t xml:space="preserve">Years of education</w:t>
-            </w:r>
-          </w:p>
-        </w:tc>
-        <w:tc>
-          <w:tcPr/>
-          <w:p>
-            <w:pPr>
-              <w:pStyle w:val="Compact"/>
-            </w:pPr>
-            <w:r>
-              <w:t xml:space="preserve">0.08‡</w:t>
-            </w:r>
-          </w:p>
-        </w:tc>
-        <w:tc>
-          <w:tcPr/>
-          <w:p>
-            <w:pPr>
-              <w:pStyle w:val="Compact"/>
-            </w:pPr>
-            <w:r>
-              <w:t xml:space="preserve">0.06‡</w:t>
-            </w:r>
-          </w:p>
-        </w:tc>
-        <w:tc>
-          <w:tcPr/>
-          <w:p>
-            <w:pPr>
-              <w:pStyle w:val="Compact"/>
-            </w:pPr>
-          </w:p>
-        </w:tc>
-      </w:tr>
-      <w:tr>
-        <w:tc>
-          <w:tcPr/>
-          <w:p>
-            <w:pPr>
-              <w:pStyle w:val="Compact"/>
-            </w:pPr>
-          </w:p>
-        </w:tc>
-        <w:tc>
-          <w:tcPr/>
-          <w:p>
-            <w:pPr>
-              <w:pStyle w:val="Compact"/>
-            </w:pPr>
-            <w:r>
-              <w:t xml:space="preserve">(0.01)</w:t>
-            </w:r>
-          </w:p>
-        </w:tc>
-        <w:tc>
-          <w:tcPr/>
-          <w:p>
-            <w:pPr>
-              <w:pStyle w:val="Compact"/>
-            </w:pPr>
-            <w:r>
-              <w:t xml:space="preserve">(0.01)</w:t>
-            </w:r>
-          </w:p>
-        </w:tc>
-        <w:tc>
-          <w:tcPr/>
-          <w:p>
-            <w:pPr>
-              <w:pStyle w:val="Compact"/>
-            </w:pPr>
-          </w:p>
-        </w:tc>
-      </w:tr>
-      <w:tr>
-        <w:tc>
-          <w:tcPr/>
-          <w:p>
-            <w:pPr>
-              <w:pStyle w:val="Compact"/>
-            </w:pPr>
-            <w:r>
               <w:t xml:space="preserve">Female</w:t>
             </w:r>
           </w:p>
@@ -255,58 +175,18 @@
               <w:pStyle w:val="Compact"/>
             </w:pPr>
             <w:r>
-              <w:t xml:space="preserve">-0.41‡</w:t>
-            </w:r>
-          </w:p>
-        </w:tc>
-        <w:tc>
-          <w:tcPr/>
-          <w:p>
-            <w:pPr>
-              <w:pStyle w:val="Compact"/>
-            </w:pPr>
-            <w:r>
-              <w:t xml:space="preserve">-0.40‡</w:t>
-            </w:r>
-          </w:p>
-        </w:tc>
-        <w:tc>
-          <w:tcPr/>
-          <w:p>
-            <w:pPr>
-              <w:pStyle w:val="Compact"/>
-            </w:pPr>
-          </w:p>
-        </w:tc>
-      </w:tr>
-      <w:tr>
-        <w:tc>
-          <w:tcPr/>
-          <w:p>
-            <w:pPr>
-              <w:pStyle w:val="Compact"/>
-            </w:pPr>
-          </w:p>
-        </w:tc>
-        <w:tc>
-          <w:tcPr/>
-          <w:p>
-            <w:pPr>
-              <w:pStyle w:val="Compact"/>
-            </w:pPr>
-            <w:r>
-              <w:t xml:space="preserve">(0.10)</w:t>
-            </w:r>
-          </w:p>
-        </w:tc>
-        <w:tc>
-          <w:tcPr/>
-          <w:p>
-            <w:pPr>
-              <w:pStyle w:val="Compact"/>
-            </w:pPr>
-            <w:r>
-              <w:t xml:space="preserve">(0.10)</w:t>
+              <w:t xml:space="preserve">-0.41‡ [-0.60, -0.24]</w:t>
+            </w:r>
+          </w:p>
+        </w:tc>
+        <w:tc>
+          <w:tcPr/>
+          <w:p>
+            <w:pPr>
+              <w:pStyle w:val="Compact"/>
+            </w:pPr>
+            <w:r>
+              <w:t xml:space="preserve">-0.40‡ [-0.59, -0.22]</w:t>
             </w:r>
           </w:p>
         </w:tc>
@@ -348,7 +228,7 @@
               <w:pStyle w:val="Compact"/>
             </w:pPr>
             <w:r>
-              <w:t xml:space="preserve">0.14*</w:t>
+              <w:t xml:space="preserve">0.14* [0.01, 0.30]</w:t>
             </w:r>
           </w:p>
         </w:tc>
@@ -360,24 +240,27 @@
             <w:pPr>
               <w:pStyle w:val="Compact"/>
             </w:pPr>
-          </w:p>
-        </w:tc>
-        <w:tc>
-          <w:tcPr/>
-          <w:p>
-            <w:pPr>
-              <w:pStyle w:val="Compact"/>
-            </w:pPr>
-          </w:p>
-        </w:tc>
-        <w:tc>
-          <w:tcPr/>
-          <w:p>
-            <w:pPr>
-              <w:pStyle w:val="Compact"/>
-            </w:pPr>
-            <w:r>
-              <w:t xml:space="preserve">(0.07)</w:t>
+            <w:r>
+              <w:t xml:space="preserve">College degree</w:t>
+            </w:r>
+          </w:p>
+        </w:tc>
+        <w:tc>
+          <w:tcPr/>
+          <w:p>
+            <w:pPr>
+              <w:pStyle w:val="Compact"/>
+            </w:pPr>
+          </w:p>
+        </w:tc>
+        <w:tc>
+          <w:tcPr/>
+          <w:p>
+            <w:pPr>
+              <w:pStyle w:val="Compact"/>
+            </w:pPr>
+            <w:r>
+              <w:t xml:space="preserve">0.30‡ [0.14, 0.49]</w:t>
             </w:r>
           </w:p>
         </w:tc>
@@ -398,83 +281,6 @@
               <w:pStyle w:val="Compact"/>
             </w:pPr>
             <w:r>
-              <w:t xml:space="preserve">College degree</w:t>
-            </w:r>
-          </w:p>
-        </w:tc>
-        <w:tc>
-          <w:tcPr/>
-          <w:p>
-            <w:pPr>
-              <w:pStyle w:val="Compact"/>
-            </w:pPr>
-          </w:p>
-        </w:tc>
-        <w:tc>
-          <w:tcPr/>
-          <w:p>
-            <w:pPr>
-              <w:pStyle w:val="Compact"/>
-            </w:pPr>
-            <w:r>
-              <w:t xml:space="preserve">0.30‡</w:t>
-            </w:r>
-          </w:p>
-        </w:tc>
-        <w:tc>
-          <w:tcPr/>
-          <w:p>
-            <w:pPr>
-              <w:pStyle w:val="Compact"/>
-            </w:pPr>
-          </w:p>
-        </w:tc>
-      </w:tr>
-      <w:tr>
-        <w:tc>
-          <w:tcPr/>
-          <w:p>
-            <w:pPr>
-              <w:pStyle w:val="Compact"/>
-            </w:pPr>
-          </w:p>
-        </w:tc>
-        <w:tc>
-          <w:tcPr/>
-          <w:p>
-            <w:pPr>
-              <w:pStyle w:val="Compact"/>
-            </w:pPr>
-          </w:p>
-        </w:tc>
-        <w:tc>
-          <w:tcPr/>
-          <w:p>
-            <w:pPr>
-              <w:pStyle w:val="Compact"/>
-            </w:pPr>
-            <w:r>
-              <w:t xml:space="preserve">(0.09)</w:t>
-            </w:r>
-          </w:p>
-        </w:tc>
-        <w:tc>
-          <w:tcPr/>
-          <w:p>
-            <w:pPr>
-              <w:pStyle w:val="Compact"/>
-            </w:pPr>
-          </w:p>
-        </w:tc>
-      </w:tr>
-      <w:tr>
-        <w:tc>
-          <w:tcPr/>
-          <w:p>
-            <w:pPr>
-              <w:pStyle w:val="Compact"/>
-            </w:pPr>
-            <w:r>
               <w:t xml:space="preserve">Num.Obs.</w:t>
             </w:r>
           </w:p>
@@ -507,21 +313,6 @@
             <w:pPr>
               <w:pStyle w:val="Compact"/>
             </w:pPr>
-          </w:p>
-        </w:tc>
-      </w:tr>
-      <w:tr>
-        <w:tc>
-          <w:tcPr>
-            <w:gridSpan w:val="4"/>
-          </w:tcPr>
-          <w:p>
-            <w:pPr>
-              <w:pStyle w:val="Compact"/>
-            </w:pPr>
-            <w:r>
-              <w:t xml:space="preserve">* p &lt; 0.05, † p &lt; 0.01, ‡ p &lt; 0.001</w:t>
-            </w:r>
           </w:p>
         </w:tc>
       </w:tr>
@@ -535,7 +326,7 @@
           <w:i/>
           <w:iCs/>
         </w:rPr>
-        <w:t xml:space="preserve">Note: 95% confidence intervals in parentheses.</w:t>
+        <w:t xml:space="preserve">Note: 95% confidence intervals in brackets.</w:t>
       </w:r>
     </w:p>
     <w:p>

</xml_diff>